<commit_message>
docs: align Word owner's SOP with fail-closed database recovery rules
</commit_message>
<xml_diff>
--- a/docs/水電好管家_業主部署與故障排除操作手冊_v0.4.docx
+++ b/docs/水電好管家_業主部署與故障排除操作手冊_v0.4.docx
@@ -701,7 +701,7 @@
               <w:rPr>
                 <w:sz w:val="18"/>
               </w:rPr>
-              <w:t xml:space="preserve">SQLite 無法開啟、資料損毀或關聯檢查失敗</w:t>
+              <w:t xml:space="preserve">SQLite 遺失、空白檔、無法開啟、損毀或關聯檢查失敗</w:t>
             </w:r>
           </w:p>
         </w:tc>
@@ -723,7 +723,7 @@
               <w:rPr>
                 <w:sz w:val="18"/>
               </w:rPr>
-              <w:t xml:space="preserve">立即停止新增刪改，保留 data/backups，聯繫交付者</w:t>
+              <w:t xml:space="preserve">立即停止操作，不要重裝或重建資料庫；保留 data/backups，聯繫交付者</w:t>
             </w:r>
           </w:p>
         </w:tc>
@@ -1522,6 +1522,15 @@
       </w:r>
       <w:r>
         <w:t xml:space="preserve">）；新版不允許把 SQLite 指向 C:\、其他文件資料夾或 UNC 網路磁碟，以免誤修改其他資料的權限。程式會以 Windows PowerShell 設定私密資料夾存取權限；權限檢查不通過將停止啟動，請提供 E_PATH 代碼給交付者。</w:t>
+      </w:r>
+    </w:p>
+    <w:p>
+      <w:pPr>
+        <w:pStyle w:val="Callout"/>
+        <w:spacing w:before="145" w:after="130"/>
+      </w:pPr>
+      <w:r>
+        <w:t>資料庫遺失防護：首次安裝須使用「啟動水電好管家.bat」自動建立管理設定。已有 .env 卻找不到 data/plumber.sqlite、或資料庫成為 0 位元組時，啟動、部署檢查及備份會立即停止並顯示 E_DB，不會建立空白資料庫或產生空白備份。請保留原資料、聯繫交付者進行隔離還原。</w:t>
       </w:r>
     </w:p>
     <w:sectPr>

</xml_diff>

<commit_message>
docs: align printable Word restore guidance with WAL-safe recovery
</commit_message>
<xml_diff>
--- a/docs/水電好管家_業主部署與故障排除操作手冊_v0.4.docx
+++ b/docs/水電好管家_業主部署與故障排除操作手冊_v0.4.docx
@@ -1330,13 +1330,52 @@
         <w:spacing w:after="115"/>
       </w:pPr>
       <w:r>
-        <w:rPr>
-          <w:b/>
-        </w:rPr>
-        <w:t xml:space="preserve">還原（建議由交付者處理）：</w:t>
-      </w:r>
-      <w:r>
-        <w:t xml:space="preserve"> 先關閉網站停止操作；封存完整 data、.env、backups；在隔離資料夾先驗證要還原的 .sqlite 備份及資料筆數；取得業主同意還原時間點後，才替換正式資料庫。還原會使備份日後新增的資料消失，不可自行刪除 WAL。</w:t>
+        <w:t xml:space="preserve">還原（僅交付人員／具 SQLite 經驗者操作）：絕不能只用備份覆寫主資料庫、卻保留舊 -wal／-shm。即使網站已關閉，也必須確認所有 Node.js、排程與資料庫連線都已完全停止。</w:t>
+      </w:r>
+    </w:p>
+    <w:p>
+      <w:pPr>
+        <w:pStyle w:val="Normal"/>
+        <w:spacing w:after="115"/>
+      </w:pPr>
+      <w:r>
+        <w:t xml:space="preserve">步驟 1｜先取得業主同意還原時間點，將原 data/plumber.sqlite 與存在的 data/plumber.sqlite-wal、data/plumber.sqlite-shm 當成同一組，連同 .env、data、backups 完整封存到受保護的隔離目錄。不可先刪除 WAL；其中可能有尚未寫回主資料庫的內容。</w:t>
+      </w:r>
+    </w:p>
+    <w:p>
+      <w:pPr>
+        <w:pStyle w:val="Normal"/>
+        <w:spacing w:after="115"/>
+      </w:pPr>
+      <w:r>
+        <w:t xml:space="preserve">步驟 2｜於隔離環境檢查欲還原的 backups/*.sqlite（不能選 .partial）的 SQLite quick_check、外鍵、客戶／工程／估價單／庫存記錄，以及備份日期。</w:t>
+      </w:r>
+    </w:p>
+    <w:p>
+      <w:pPr>
+        <w:pStyle w:val="Normal"/>
+        <w:spacing w:after="115"/>
+      </w:pPr>
+      <w:r>
+        <w:t xml:space="preserve">步驟 3｜確認所有處理程序已停止，將舊主 .sqlite、同名 -wal、-shm（存在者）整組移離正式 data/ 位置，保留封存副本。若檔案被鎖定或無法完整封存，立即停止還原，不得強行覆寫。</w:t>
+      </w:r>
+    </w:p>
+    <w:p>
+      <w:pPr>
+        <w:pStyle w:val="Normal"/>
+        <w:spacing w:after="115"/>
+      </w:pPr>
+      <w:r>
+        <w:t xml:space="preserve">步驟 4｜確認正式 data/ 中沒有舊的 plumber.sqlite-wal 或 plumber.sqlite-shm，然後把已驗證的備份 .sqlite 複製成 data/plumber.sqlite；再執行部署檢查，啟動並核對各類資料是否符合選定時間點。</w:t>
+      </w:r>
+    </w:p>
+    <w:p>
+      <w:pPr>
+        <w:pStyle w:val="Normal"/>
+        <w:spacing w:after="115"/>
+      </w:pPr>
+      <w:r>
+        <w:t xml:space="preserve">提醒｜已封存的舊 WAL/SHM 絕不可放回已還原資料庫旁；還原日期以後新增的資料可能不存在。業主請勿自行刪 WAL／SHM 或在線上進行還原。</w:t>
       </w:r>
     </w:p>
     <w:p>
@@ -1603,6 +1642,15 @@
       </w:pPr>
       <w:r>
         <w:t xml:space="preserve">所有歷史備份都存於本機 backups 目錄，仍可能與原硬碟一起損壞。建議重要備份定期複製到受保護的其他儲存裝置。</w:t>
+      </w:r>
+    </w:p>
+    <w:p>
+      <w:pPr>
+        <w:pStyle w:val="Callout"/>
+        <w:spacing w:after="115"/>
+      </w:pPr>
+      <w:r>
+        <w:t xml:space="preserve">中斷備份清理｜斷電可能留下 .sqlite.partial 與 .sqlite.lock；這些不是可還原的正式副本。系統會在排程啟動或下次備份前，僅對過期且確認無存活備份程序的本系統暫存檔做保守清理，不會刪除已驗證的 .sqlite；請勿自行刪除未知檔案。</w:t>
       </w:r>
     </w:p>
     <w:sectPr>

</xml_diff>

<commit_message>
docs: align owner Word backup guide and assert parity with Markdown
</commit_message>
<xml_diff>
--- a/docs/水電好管家_業主部署與故障排除操作手冊_v0.4.docx
+++ b/docs/水電好管家_業主部署與故障排除操作手冊_v0.4.docx
@@ -1577,7 +1577,7 @@
         <w:pStyle w:val="Heading1"/>
       </w:pPr>
       <w:r>
-        <w:t xml:space="preserve">八、網站每日自動備份與歷史版本管理</w:t>
+        <w:t xml:space="preserve">八、網站自動備份與歷史版本管理</w:t>
       </w:r>
     </w:p>
     <w:p>
@@ -1593,15 +1593,15 @@
         <w:pStyle w:val="Normal"/>
       </w:pPr>
       <w:r>
-        <w:t xml:space="preserve">預設每 1 天自動備份一次，並保留最近 50 份自動備份；可把備份間隔改為 1～365 天，把保留份數改為 1～500 份，然後儲存設定。</w:t>
-      </w:r>
-    </w:p>
-    <w:p>
-      <w:pPr>
-        <w:pStyle w:val="Normal"/>
-      </w:pPr>
-      <w:r>
-        <w:t xml:space="preserve">「立即建立手動備份」可產生額外副本；備份清單顯示時間、類型、大小，並提供下載或經確認後刪除。</w:t>
+        <w:t xml:space="preserve">預設每 1 天檢查是否需要建立自動備份，最多保留最近 50 份自動備份；可把備份間隔改為 1～365 天、保留份數改為 1～500 份，然後儲存設定。</w:t>
+      </w:r>
+    </w:p>
+    <w:p>
+      <w:pPr>
+        <w:pStyle w:val="Normal"/>
+      </w:pPr>
+      <w:r>
+        <w:t xml:space="preserve">「立即建立手動備份」即使沒有業務資料異動，也會依照使用者要求產生額外副本；備份清單顯示時間、類型、大小，並提供下載或經確認後刪除。</w:t>
       </w:r>
     </w:p>
     <w:p>
@@ -1617,15 +1617,15 @@
         <w:pStyle w:val="Callout"/>
       </w:pPr>
       <w:r>
-        <w:t xml:space="preserve">系統開啟期間每分鐘檢查排程。關機或關閉啟動視窗時不會自動備份；下次啟動若已逾期，會補做一份，不逐日補建。</w:t>
-      </w:r>
-    </w:p>
-    <w:p>
-      <w:pPr>
-        <w:pStyle w:val="Normal"/>
-      </w:pPr>
-      <w:r>
-        <w:t xml:space="preserve">備份使用 SQLite 一致性快照並驗證資料庫與核心表資料；失敗會在備份管理頁留下提示。</w:t>
+        <w:t xml:space="preserve">系統開啟期間每分鐘檢查排程是否到期；到期時與最新有效自動備份比對，只有業務資料異動才新增備份。沒有業務資料異動時略過，不新增檔案、不占保留名額，並更新「上次自動檢查」與下次排程。關機時不執行；重新啟動若已逾期，只檢查一次，不逐日補建。</w:t>
+      </w:r>
+    </w:p>
+    <w:p>
+      <w:pPr>
+        <w:pStyle w:val="Normal"/>
+      </w:pPr>
+      <w:r>
+        <w:t xml:space="preserve">排程設定本身、SQLite 檔案修改時間及 WAL 變化不算業務資料異動；前次自動備份遺失或損壞、無法驗證時，仍會嘗試建立新的有效備份，避免錯誤略過。實際備份使用 SQLite 一致性快照並驗證資料庫及核心資料表；失敗會在備份管理頁提示。</w:t>
       </w:r>
     </w:p>
     <w:p>

</xml_diff>